<commit_message>
ADD new szorg. task amd Beszámoló
</commit_message>
<xml_diff>
--- a/Nagypál Márton Péter - n8n beszámoló.docx
+++ b/Nagypál Márton Péter - n8n beszámoló.docx
@@ -21,9 +21,8 @@
           <w:szCs w:val="36"/>
           <w:shd w:val="clear" w:color="auto" w:fill="FFFFD7"/>
         </w:rPr>
-        <w:t xml:space="preserve">AI-vezérelt tartalomgeneráló </w:t>
-      </w:r>
-      <w:proofErr w:type="spellStart"/>
+        <w:t>AI-vezérelt tartalomgeneráló workflow</w:t>
+      </w:r>
       <w:r>
         <w:rPr>
           <w:color w:val="000000"/>
@@ -31,9 +30,8 @@
           <w:szCs w:val="36"/>
           <w:shd w:val="clear" w:color="auto" w:fill="FFFFD7"/>
         </w:rPr>
-        <w:t>workflow</w:t>
-      </w:r>
-      <w:proofErr w:type="spellEnd"/>
+        <w:t>:</w:t>
+      </w:r>
       <w:r>
         <w:rPr>
           <w:color w:val="000000"/>
@@ -41,7 +39,7 @@
           <w:szCs w:val="36"/>
           <w:shd w:val="clear" w:color="auto" w:fill="FFFFD7"/>
         </w:rPr>
-        <w:t>:</w:t>
+        <w:br/>
       </w:r>
       <w:r>
         <w:rPr>
@@ -50,15 +48,6 @@
           <w:szCs w:val="36"/>
           <w:shd w:val="clear" w:color="auto" w:fill="FFFFD7"/>
         </w:rPr>
-        <w:br/>
-      </w:r>
-      <w:r>
-        <w:rPr>
-          <w:color w:val="000000"/>
-          <w:sz w:val="36"/>
-          <w:szCs w:val="36"/>
-          <w:shd w:val="clear" w:color="auto" w:fill="FFFFD7"/>
-        </w:rPr>
         <w:t>Hírek automatizált feldolgozása és platform-specifikus</w:t>
       </w:r>
     </w:p>
@@ -125,35 +114,7 @@
         <w:rPr>
           <w:shd w:val="clear" w:color="auto" w:fill="FFFFD7"/>
         </w:rPr>
-        <w:t xml:space="preserve">A feladat célja egy olyan n8n alapú </w:t>
-      </w:r>
-      <w:proofErr w:type="spellStart"/>
-      <w:r>
-        <w:rPr>
-          <w:shd w:val="clear" w:color="auto" w:fill="FFFFD7"/>
-        </w:rPr>
-        <w:t>workflow-automatizációs</w:t>
-      </w:r>
-      <w:proofErr w:type="spellEnd"/>
-      <w:r>
-        <w:rPr>
-          <w:shd w:val="clear" w:color="auto" w:fill="FFFFD7"/>
-        </w:rPr>
-        <w:t xml:space="preserve"> prototípus megtervezése és megvalósítása, amely egyetemi vagy tanszéki hírek (például RSS vagy HTML források) feldolgozásával automatikusan platform-specifikus közösségi média tartalmakat állít elő. A projekt arra a valós problémára ad megoldást, hogy a hivatalos webes kommunikáció közösségi platformokra (például </w:t>
-      </w:r>
-      <w:proofErr w:type="spellStart"/>
-      <w:r>
-        <w:rPr>
-          <w:shd w:val="clear" w:color="auto" w:fill="FFFFD7"/>
-        </w:rPr>
-        <w:t>LinkedIn</w:t>
-      </w:r>
-      <w:proofErr w:type="spellEnd"/>
-      <w:r>
-        <w:rPr>
-          <w:shd w:val="clear" w:color="auto" w:fill="FFFFD7"/>
-        </w:rPr>
-        <w:t>, Facebook, X) történő adaptálása jelenleg jelentős és repetitív emberi erőforrást igényel. A tervezett rendszer a bejövő tartalmak értelmezésére, strukturálására és újraírására nagy nyelvi modelleket, illetve AI ágenseket használ.</w:t>
+        <w:t>A feladat célja egy olyan n8n alapú workflow-automatizációs prototípus megtervezése és megvalósítása, amely egyetemi vagy tanszéki hírek (például RSS vagy HTML források) feldolgozásával automatikusan platform-specifikus közösségi média tartalmakat állít elő. A projekt arra a valós problémára ad megoldást, hogy a hivatalos webes kommunikáció közösségi platformokra (például LinkedIn, Facebook, X) történő adaptálása jelenleg jelentős és repetitív emberi erőforrást igényel. A tervezett rendszer a bejövő tartalmak értelmezésére, strukturálására és újraírására nagy nyelvi modelleket, illetve AI ágenseket használ.</w:t>
       </w:r>
       <w:r>
         <w:rPr>
@@ -185,35 +146,7 @@
         <w:rPr>
           <w:shd w:val="clear" w:color="auto" w:fill="FFFFD7"/>
         </w:rPr>
-        <w:t xml:space="preserve">n8n </w:t>
-      </w:r>
-      <w:proofErr w:type="spellStart"/>
-      <w:r>
-        <w:rPr>
-          <w:shd w:val="clear" w:color="auto" w:fill="FFFFD7"/>
-        </w:rPr>
-        <w:t>workflow</w:t>
-      </w:r>
-      <w:proofErr w:type="spellEnd"/>
-      <w:r>
-        <w:rPr>
-          <w:shd w:val="clear" w:color="auto" w:fill="FFFFD7"/>
-        </w:rPr>
-        <w:t xml:space="preserve">, AI </w:t>
-      </w:r>
-      <w:proofErr w:type="spellStart"/>
-      <w:r>
-        <w:rPr>
-          <w:shd w:val="clear" w:color="auto" w:fill="FFFFD7"/>
-        </w:rPr>
-        <w:t>Agent</w:t>
-      </w:r>
-      <w:proofErr w:type="spellEnd"/>
-      <w:r>
-        <w:rPr>
-          <w:shd w:val="clear" w:color="auto" w:fill="FFFFD7"/>
-        </w:rPr>
-        <w:t>, MI alapú hírgeneráló, eseményfelismerő</w:t>
+        <w:t>n8n workflow, AI Agent, MI alapú hírgeneráló, eseményfelismerő</w:t>
       </w:r>
     </w:p>
     <w:p>
@@ -493,39 +426,7 @@
         <w:pStyle w:val="Szvegtrzs"/>
       </w:pPr>
       <w:r>
-        <w:t>A féléves feladat elsődleges célja nem egy klasszikus, monolitikus vagy hagyományos végfelhasználói frontend-backend alkalmazás lefejlesztése volt. A cél egy olyan modern, AI-ágensekre és a legújabb MCP (</w:t>
-      </w:r>
-      <w:proofErr w:type="spellStart"/>
-      <w:r>
-        <w:t>Model</w:t>
-      </w:r>
-      <w:proofErr w:type="spellEnd"/>
-      <w:r>
-        <w:t xml:space="preserve"> Context </w:t>
-      </w:r>
-      <w:proofErr w:type="spellStart"/>
-      <w:r>
-        <w:t>Protocol</w:t>
-      </w:r>
-      <w:proofErr w:type="spellEnd"/>
-      <w:r>
-        <w:t xml:space="preserve">) szabványra épülő gyakorlati automatizálási </w:t>
-      </w:r>
-      <w:proofErr w:type="spellStart"/>
-      <w:r>
-        <w:t>stack</w:t>
-      </w:r>
-      <w:proofErr w:type="spellEnd"/>
-      <w:r>
-        <w:t xml:space="preserve"> és </w:t>
-      </w:r>
-      <w:proofErr w:type="spellStart"/>
-      <w:r>
-        <w:t>demo</w:t>
-      </w:r>
-      <w:proofErr w:type="spellEnd"/>
-      <w:r>
-        <w:t xml:space="preserve"> környezet kialakítása, amely képes kezelni az egyetemi hírforrásokból adódó strukturálatlan káoszt.</w:t>
+        <w:t>A féléves feladat elsődleges célja nem egy klasszikus, monolitikus vagy hagyományos végfelhasználói frontend-backend alkalmazás lefejlesztése volt. A cél egy olyan modern, AI-ágensekre és a legújabb MCP szabványra épülő gyakorlati automatizálási stack és demo környezet kialakítása, amely képes kezelni az egyetemi hírforrásokból adódó strukturálatlan káoszt.</w:t>
       </w:r>
     </w:p>
     <w:p>
@@ -533,23 +434,7 @@
         <w:pStyle w:val="Szvegtrzs"/>
       </w:pPr>
       <w:r>
-        <w:t xml:space="preserve">A konkrét mérnöki problémát az jelenti, hogy az egyetemi oldalak (különös tekintettel a BME, a VIK és a TMIT sajátos, sokszor elavult vagy nehezen </w:t>
-      </w:r>
-      <w:proofErr w:type="spellStart"/>
-      <w:r>
-        <w:t>parse-olható</w:t>
-      </w:r>
-      <w:proofErr w:type="spellEnd"/>
-      <w:r>
-        <w:t xml:space="preserve"> HTML struktúráira) nem biztosítanak egységes API-</w:t>
-      </w:r>
-      <w:proofErr w:type="spellStart"/>
-      <w:r>
-        <w:t>kat</w:t>
-      </w:r>
-      <w:proofErr w:type="spellEnd"/>
-      <w:r>
-        <w:t xml:space="preserve"> a hírek és események követésére. Ha egy hallgató vagy egy szervezeti egység értesülni akar a legfrissebb eseményekről, vagy ezekből közösségimédia-posztokat szeretne generálni, azt eddig csak manuális másolgatással lehetett megoldani.</w:t>
+        <w:t>A problémát az jelenti, hogy az egyetemi oldalak nem biztosítanak egységes API-kat a hírek és események követésére. Ha egy hallgató vagy egy szervezeti egység értesülni akar a legfrissebb eseményekről, vagy ezekből közösségimédia-posztokat szeretne generálni, azt eddig csak manuális másolgatással lehetett megoldani.</w:t>
       </w:r>
     </w:p>
     <w:p>
@@ -557,31 +442,7 @@
         <w:pStyle w:val="Szvegtrzs"/>
       </w:pPr>
       <w:r>
-        <w:t>A projekt keretében egy olyan csővezetéket (</w:t>
-      </w:r>
-      <w:proofErr w:type="spellStart"/>
-      <w:r>
-        <w:t>pipeline</w:t>
-      </w:r>
-      <w:proofErr w:type="spellEnd"/>
-      <w:r>
-        <w:t xml:space="preserve">) hoztam létre, amely automatizáltan képes ezen specifikus források tartalmát ellenőrizni, a releváns adatokat és eseménytípusokat kinyerni, majd azokból a különböző platformok elvárásaihoz igazodó közösségimédia-posztokat vagy strukturált összefoglalókat gyártani. A cél az volt, hogy a nyers, formázatlan webes inputokból olyan tiszta, </w:t>
-      </w:r>
-      <w:proofErr w:type="spellStart"/>
-      <w:r>
-        <w:t>downstream</w:t>
-      </w:r>
-      <w:proofErr w:type="spellEnd"/>
-      <w:r>
-        <w:t xml:space="preserve"> eszközök (például az n8n </w:t>
-      </w:r>
-      <w:proofErr w:type="spellStart"/>
-      <w:r>
-        <w:t>workflow</w:t>
-      </w:r>
-      <w:proofErr w:type="spellEnd"/>
-      <w:r>
-        <w:t xml:space="preserve"> motor vagy további ágensek) számára azonnal értelmezhető adatokat kapjunk, amelyek emberi beavatkozás nélkül is megbízhatóan felhasználhatók.</w:t>
+        <w:t>A projekt keretében egy olyan csővezetéket (pipeline) hoztam létre, amely automatizáltan képes ezen specifikus források tartalmát ellenőrizni, a releváns adatokat és eseménytípusokat kinyerni, majd azokból a különböző platformok elvárásaihoz igazodó közösségimédia-posztokat vagy strukturált összefoglalókat gyártani. A cél az volt, hogy a nyers, formázatlan webes inputokból olyan tiszta, downstream eszközök (például az n8n workflow motor vagy további ágensek) számára azonnal értelmezhető adatokat kapjunk, amelyek emberi beavatkozás nélkül is megbízhatóan felhasználhatók.</w:t>
       </w:r>
     </w:p>
     <w:p>
@@ -609,31 +470,7 @@
         <w:pStyle w:val="Szvegtrzs"/>
       </w:pPr>
       <w:r>
-        <w:t>A projekt lelke és lényegi saját fejlesztése a fastmcp_server.py fájlban található. Ez a komponens egy „</w:t>
-      </w:r>
-      <w:proofErr w:type="spellStart"/>
-      <w:r>
-        <w:t>news-to-social-agent</w:t>
-      </w:r>
-      <w:proofErr w:type="spellEnd"/>
-      <w:r>
-        <w:t xml:space="preserve">” nevű MCP szervert valósít meg. A fejlesztés során kifejezetten figyeltem arra, hogy a szerver rugalmasan illeszthető legyen, így egy </w:t>
-      </w:r>
-      <w:proofErr w:type="spellStart"/>
-      <w:r>
-        <w:t>FastAPI</w:t>
-      </w:r>
-      <w:proofErr w:type="spellEnd"/>
-      <w:r>
-        <w:t xml:space="preserve"> </w:t>
-      </w:r>
-      <w:proofErr w:type="spellStart"/>
-      <w:r>
-        <w:t>wrapper</w:t>
-      </w:r>
-      <w:proofErr w:type="spellEnd"/>
-      <w:r>
-        <w:t xml:space="preserve"> segítségével kettős interfészt adtam neki: natív MCP-klienseken keresztül is hívható, de sima HTTP REST API-ként is funkcionál, ami nagyban megkönnyítette a tesztelést.</w:t>
+        <w:t>A projekt lelke és lényegi saját fejlesztése a fastmcp_server.py fájlban található. Ez a komponens egy „news-to-social-agent” nevű MCP szervert valósít meg. A fejlesztés során kifejezetten figyeltem arra, hogy a szerver rugalmasan illeszthető legyen, így egy FastAPI wrapper segítségével kettős interfészt adtam neki: natív MCP-klienseken keresztül is hívható, de sima HTTP REST API-ként is funkcionál, ami nagyban megkönnyítette a tesztelést.</w:t>
       </w:r>
     </w:p>
     <w:p>
@@ -643,98 +480,39 @@
       <w:r>
         <w:t xml:space="preserve">A háttérben zajló intelligens feldolgozásért és a posztok generálásáért a </w:t>
       </w:r>
-      <w:proofErr w:type="spellStart"/>
       <w:r>
         <w:rPr>
           <w:b/>
           <w:bCs/>
         </w:rPr>
-        <w:t>Mistral</w:t>
-      </w:r>
-      <w:proofErr w:type="spellEnd"/>
+        <w:t>Mistral Large (latest)</w:t>
+      </w:r>
+      <w:r>
+        <w:t xml:space="preserve"> modell felel. Azért erre a modellre esett a választás, mert a tesztek során ez mutatta a legjobb komplex szövegértési és strukturálási képességet a magyar nyelvű egyetemi kontextusban, miközben megbízhatóan követte a System Promptban kiadott utasításokat.</w:t>
+      </w:r>
+    </w:p>
+    <w:p>
+      <w:pPr>
+        <w:pStyle w:val="Szvegtrzs"/>
+      </w:pPr>
+      <w:r>
+        <w:t xml:space="preserve">Mivel az LLM-ek kimenete hajlamos a strukturális instabilitásra, a megbízhatóság érdekében beemeltem a </w:t>
+      </w:r>
       <w:r>
         <w:rPr>
           <w:b/>
           <w:bCs/>
         </w:rPr>
-        <w:t xml:space="preserve"> </w:t>
-      </w:r>
-      <w:proofErr w:type="spellStart"/>
-      <w:r>
-        <w:rPr>
-          <w:b/>
-          <w:bCs/>
-        </w:rPr>
-        <w:t>Large</w:t>
-      </w:r>
-      <w:proofErr w:type="spellEnd"/>
-      <w:r>
-        <w:rPr>
-          <w:b/>
-          <w:bCs/>
-        </w:rPr>
-        <w:t xml:space="preserve"> (latest)</w:t>
-      </w:r>
-      <w:r>
-        <w:t xml:space="preserve"> modell felel. Azért erre a modellre esett a választás, mert a tesztek során ez mutatta a legjobb komplex szövegértési és strukturálási képességet a magyar nyelvű egyetemi kontextusban, miközben megbízhatóan követte a System </w:t>
-      </w:r>
-      <w:proofErr w:type="spellStart"/>
-      <w:r>
-        <w:t>Promptban</w:t>
-      </w:r>
-      <w:proofErr w:type="spellEnd"/>
-      <w:r>
-        <w:t xml:space="preserve"> kiadott utasításokat.</w:t>
-      </w:r>
-    </w:p>
-    <w:p>
-      <w:pPr>
-        <w:pStyle w:val="Szvegtrzs"/>
-      </w:pPr>
-      <w:r>
-        <w:t xml:space="preserve">Mivel az LLM-ek kimenete hajlamos a strukturális instabilitásra, a megbízhatóság érdekében beemeltem a </w:t>
-      </w:r>
-      <w:proofErr w:type="spellStart"/>
-      <w:r>
-        <w:rPr>
-          <w:b/>
-          <w:bCs/>
-        </w:rPr>
         <w:t>Pydantic</w:t>
       </w:r>
-      <w:proofErr w:type="spellEnd"/>
-      <w:r>
-        <w:t xml:space="preserve"> </w:t>
-      </w:r>
-      <w:proofErr w:type="spellStart"/>
-      <w:r>
-        <w:t>frameworköt</w:t>
-      </w:r>
-      <w:proofErr w:type="spellEnd"/>
-      <w:r>
-        <w:t xml:space="preserve">. </w:t>
+      <w:r>
+        <w:t xml:space="preserve"> frameworköt. </w:t>
       </w:r>
       <w:r>
         <w:t xml:space="preserve">Ennek </w:t>
       </w:r>
       <w:r>
-        <w:t xml:space="preserve">segítségével szigorú adatmodelleket definiáltam a hírekre és eseménytípusokra vonatkozóan. Így az ágens által visszaadott válasz formátumát kód szinten </w:t>
-      </w:r>
-      <w:proofErr w:type="spellStart"/>
-      <w:r>
-        <w:t>validáljuk</w:t>
-      </w:r>
-      <w:proofErr w:type="spellEnd"/>
-      <w:r>
-        <w:t xml:space="preserve">; ha a modell kimenete nem felel meg a kikényszerített sémának, az hibaként jelentkezik, elkerülve ezzel a hibás adatok </w:t>
-      </w:r>
-      <w:proofErr w:type="spellStart"/>
-      <w:r>
-        <w:t>továbbküldését</w:t>
-      </w:r>
-      <w:proofErr w:type="spellEnd"/>
-      <w:r>
-        <w:t xml:space="preserve"> az n8n felé.</w:t>
+        <w:t>segítségével szigorú adatmodelleket definiáltam a hírekre és eseménytípusokra vonatkozóan. Így az ágens által visszaadott válasz formátumát kód szinten validáljuk; ha a modell kimenete nem felel meg a kikényszerített sémának, az hibaként jelentkezik, elkerülve ezzel a hibás adatok továbbküldését az n8n felé.</w:t>
       </w:r>
     </w:p>
     <w:p>
@@ -762,15 +540,7 @@
         <w:pStyle w:val="Szvegtrzs"/>
       </w:pPr>
       <w:r>
-        <w:t xml:space="preserve">Mivel közvetlenül másolható, kész mintamegoldás nem létezett erre a specifikus egyetemi problémára, a rendszert a modern ágens-alapú architektúrák elvei szerint terveztem meg. Itt a logikai vezérlés, a nyelvi modell és a kontextust biztosító memória élesen elkülönül egymástól. Az alábbi elvi ábra szemlélteti ezt a felépítést, ahol jól látszik, hogyan kapcsolódik össze a </w:t>
-      </w:r>
-      <w:proofErr w:type="spellStart"/>
-      <w:r>
-        <w:t>workflow</w:t>
-      </w:r>
-      <w:proofErr w:type="spellEnd"/>
-      <w:r>
-        <w:t xml:space="preserve"> motor a külső ágens-eszközökkel és a háttértárakkal:</w:t>
+        <w:t>Mivel közvetlenül másolható, kész mintamegoldás nem létezett erre a specifikus egyetemi problémára, a rendszert a modern ágens-alapú architektúrák elvei szerint terveztem meg. Itt a logikai vezérlés, a nyelvi modell és a kontextust biztosító memória élesen elkülönül egymástól. Az alábbi elvi ábra szemlélteti ezt a felépítést, ahol jól látszik, hogyan kapcsolódik össze a workflow motor a külső ágens-eszközökkel és a háttértárakkal:</w:t>
       </w:r>
     </w:p>
     <w:p>
@@ -778,47 +548,7 @@
         <w:pStyle w:val="Szvegtrzs"/>
       </w:pPr>
       <w:r>
-        <w:t xml:space="preserve">A teljes rendszer hordozhatósága és a laborok/saját gépek közötti könnyű </w:t>
-      </w:r>
-      <w:proofErr w:type="spellStart"/>
-      <w:r>
-        <w:t>migrálhatóság</w:t>
-      </w:r>
-      <w:proofErr w:type="spellEnd"/>
-      <w:r>
-        <w:t xml:space="preserve"> érdekében a futtatási modell teljesen </w:t>
-      </w:r>
-      <w:proofErr w:type="spellStart"/>
-      <w:r>
-        <w:t>konténerizált</w:t>
-      </w:r>
-      <w:proofErr w:type="spellEnd"/>
-      <w:r>
-        <w:t xml:space="preserve">, </w:t>
-      </w:r>
-      <w:proofErr w:type="spellStart"/>
-      <w:r>
-        <w:t>microservices</w:t>
-      </w:r>
-      <w:proofErr w:type="spellEnd"/>
-      <w:r>
-        <w:t xml:space="preserve"> jellegű. A Dockerfile egy tiszta Python 3.11-es környezetet épít fel a szervernek (telepítve a requirements.txt függőségeit), míg a </w:t>
-      </w:r>
-      <w:proofErr w:type="spellStart"/>
-      <w:r>
-        <w:t>docker-compose.yml</w:t>
-      </w:r>
-      <w:proofErr w:type="spellEnd"/>
-      <w:r>
-        <w:t xml:space="preserve"> a teljes infrastruktúra-</w:t>
-      </w:r>
-      <w:proofErr w:type="spellStart"/>
-      <w:r>
-        <w:t>stacket</w:t>
-      </w:r>
-      <w:proofErr w:type="spellEnd"/>
-      <w:r>
-        <w:t xml:space="preserve"> összefogja:</w:t>
+        <w:t>A teljes rendszer hordozhatósága és a laborok/saját gépek közötti könnyű migrálhatóság érdekében a futtatási modell teljesen konténerizált, microservices jellegű. A Dockerfile egy tiszta Python 3.11-es környezetet épít fel a szervernek (telepítve a requirements.txt függőségeit), míg a docker-compose.yml a teljes infrastruktúra-stacket összefogja:</w:t>
       </w:r>
     </w:p>
     <w:p>
@@ -834,23 +564,7 @@
           <w:b/>
           <w:bCs/>
         </w:rPr>
-        <w:t xml:space="preserve">n8n </w:t>
-      </w:r>
-      <w:proofErr w:type="spellStart"/>
-      <w:r>
-        <w:rPr>
-          <w:b/>
-          <w:bCs/>
-        </w:rPr>
-        <w:t>workflow</w:t>
-      </w:r>
-      <w:proofErr w:type="spellEnd"/>
-      <w:r>
-        <w:rPr>
-          <w:b/>
-          <w:bCs/>
-        </w:rPr>
-        <w:t xml:space="preserve"> motor:</w:t>
+        <w:t>n8n workflow motor:</w:t>
       </w:r>
       <w:r>
         <w:t xml:space="preserve"> Ez a vizuális felület felel a folyamatok ütemezéséért (például a napi legalább egyszeri automatikus futás kikényszerítéséért), a HTTP kérések indításáért és az adatok végső továbbításáért.</w:t>
@@ -864,49 +578,16 @@
           <w:numId w:val="9"/>
         </w:numPr>
       </w:pPr>
-      <w:proofErr w:type="spellStart"/>
       <w:r>
         <w:rPr>
           <w:b/>
           <w:bCs/>
         </w:rPr>
         <w:lastRenderedPageBreak/>
-        <w:t>Redis</w:t>
-      </w:r>
-      <w:proofErr w:type="spellEnd"/>
-      <w:r>
-        <w:rPr>
-          <w:b/>
-          <w:bCs/>
-        </w:rPr>
-        <w:t xml:space="preserve"> kulcs-érték tároló:</w:t>
-      </w:r>
-      <w:r>
-        <w:t xml:space="preserve"> A memóriakezelésért felelős komponens, ami az ágens-kontextus </w:t>
-      </w:r>
-      <w:proofErr w:type="spellStart"/>
-      <w:r>
-        <w:t>perzisztenciáját</w:t>
-      </w:r>
-      <w:proofErr w:type="spellEnd"/>
-      <w:r>
-        <w:t xml:space="preserve"> biztosítja (a </w:t>
-      </w:r>
-      <w:proofErr w:type="spellStart"/>
-      <w:r>
-        <w:t>Redis</w:t>
-      </w:r>
-      <w:proofErr w:type="spellEnd"/>
-      <w:r>
-        <w:t xml:space="preserve"> chat </w:t>
-      </w:r>
-      <w:proofErr w:type="spellStart"/>
-      <w:r>
-        <w:t>memory</w:t>
-      </w:r>
-      <w:proofErr w:type="spellEnd"/>
-      <w:r>
-        <w:t xml:space="preserve"> integrációnak köszönhetően az ágens képes emlékezni a korábbi futások állapotaira, ami sokat javított a konzisztencián).</w:t>
+        <w:t>Redis kulcs-érték tároló:</w:t>
+      </w:r>
+      <w:r>
+        <w:t xml:space="preserve"> A memóriakezelésért felelős komponens, ami az ágens-kontextus perzisztenciáját biztosítja (a Redis chat memory integrációnak köszönhetően az ágens képes emlékezni a korábbi futások állapotaira, ami sokat javított a konzisztencián).</w:t>
       </w:r>
     </w:p>
     <w:p>
@@ -925,39 +606,7 @@
         <w:t>Saját MCP szerver konténer:</w:t>
       </w:r>
       <w:r>
-        <w:t xml:space="preserve"> A </w:t>
-      </w:r>
-      <w:proofErr w:type="spellStart"/>
-      <w:r>
-        <w:t>FastAPI</w:t>
-      </w:r>
-      <w:proofErr w:type="spellEnd"/>
-      <w:r>
-        <w:t>/</w:t>
-      </w:r>
-      <w:proofErr w:type="spellStart"/>
-      <w:r>
-        <w:t>Pydantic</w:t>
-      </w:r>
-      <w:proofErr w:type="spellEnd"/>
-      <w:r>
-        <w:t xml:space="preserve"> alapú egyedi logika, ami a </w:t>
-      </w:r>
-      <w:proofErr w:type="spellStart"/>
-      <w:r>
-        <w:t>Mistral</w:t>
-      </w:r>
-      <w:proofErr w:type="spellEnd"/>
-      <w:r>
-        <w:t xml:space="preserve"> </w:t>
-      </w:r>
-      <w:proofErr w:type="spellStart"/>
-      <w:r>
-        <w:t>Large</w:t>
-      </w:r>
-      <w:proofErr w:type="spellEnd"/>
-      <w:r>
-        <w:t xml:space="preserve"> modellt meghajtja.</w:t>
+        <w:t xml:space="preserve"> A FastAPI/Pydantic alapú egyedi logika, ami a Mistral Large modellt meghajtja.</w:t>
       </w:r>
     </w:p>
     <w:p>
@@ -965,15 +614,7 @@
         <w:pStyle w:val="Szvegtrzs"/>
       </w:pPr>
       <w:r>
-        <w:t xml:space="preserve">A projekt így egy komplex, de működőképes egyetemi példán keresztül demonstrálja, hogyan lehet strukturálatlan hírforrásokból kiindulva egy modern, </w:t>
-      </w:r>
-      <w:proofErr w:type="spellStart"/>
-      <w:r>
-        <w:t>validált</w:t>
-      </w:r>
-      <w:proofErr w:type="spellEnd"/>
-      <w:r>
-        <w:t xml:space="preserve"> és teljesen automatizált AI-kimenetet előállító infrastruktúrát összeállítani.</w:t>
+        <w:t>A projekt így egy komplex, de működőképes egyetemi példán keresztül demonstrálja, hogyan lehet strukturálatlan hírforrásokból kiindulva egy modern, validált és teljesen automatizált AI-kimenetet előállító infrastruktúrát összeállítani.</w:t>
       </w:r>
       <w:r>
         <w:br w:type="page"/>
@@ -1131,35 +772,6 @@
           <w:bCs/>
           <w:shd w:val="clear" w:color="auto" w:fill="FFFFD7"/>
         </w:rPr>
-        <w:t>VIK (Villamosmérnöki és Informatikai Kar) központi hírei:</w:t>
-      </w:r>
-      <w:r>
-        <w:rPr>
-          <w:shd w:val="clear" w:color="auto" w:fill="FFFFD7"/>
-        </w:rPr>
-        <w:t xml:space="preserve"> Általános kari bejelentések, határidők.</w:t>
-      </w:r>
-    </w:p>
-    <w:p>
-      <w:pPr>
-        <w:numPr>
-          <w:ilvl w:val="0"/>
-          <w:numId w:val="14"/>
-        </w:numPr>
-        <w:tabs>
-          <w:tab w:val="left" w:pos="542"/>
-        </w:tabs>
-        <w:spacing w:after="240"/>
-        <w:rPr>
-          <w:shd w:val="clear" w:color="auto" w:fill="FFFFD7"/>
-        </w:rPr>
-      </w:pPr>
-      <w:r>
-        <w:rPr>
-          <w:b/>
-          <w:bCs/>
-          <w:shd w:val="clear" w:color="auto" w:fill="FFFFD7"/>
-        </w:rPr>
         <w:t>BME központi weboldal eseményei:</w:t>
       </w:r>
       <w:r>
@@ -1214,19 +826,11 @@
           <w:shd w:val="clear" w:color="auto" w:fill="FFFFD7"/>
         </w:rPr>
       </w:pPr>
-      <w:proofErr w:type="gramStart"/>
-      <w:r>
-        <w:rPr>
-          <w:shd w:val="clear" w:color="auto" w:fill="FFFFD7"/>
-        </w:rPr>
-        <w:t>&lt;!--</w:t>
-      </w:r>
-      <w:proofErr w:type="gramEnd"/>
-      <w:r>
-        <w:rPr>
-          <w:shd w:val="clear" w:color="auto" w:fill="FFFFD7"/>
-        </w:rPr>
-        <w:t xml:space="preserve"> Példa egy strukturálatlan VIK-es hírforrásra --&gt;</w:t>
+      <w:r>
+        <w:rPr>
+          <w:shd w:val="clear" w:color="auto" w:fill="FFFFD7"/>
+        </w:rPr>
+        <w:t>&lt;!-- Példa egy strukturálatlan VIK-es hírforrásra --&gt;</w:t>
       </w:r>
     </w:p>
     <w:p>
@@ -1243,35 +847,7 @@
         <w:rPr>
           <w:shd w:val="clear" w:color="auto" w:fill="FFFFD7"/>
         </w:rPr>
-        <w:t xml:space="preserve">&lt;div </w:t>
-      </w:r>
-      <w:proofErr w:type="spellStart"/>
-      <w:r>
-        <w:rPr>
-          <w:shd w:val="clear" w:color="auto" w:fill="FFFFD7"/>
-        </w:rPr>
-        <w:t>class</w:t>
-      </w:r>
-      <w:proofErr w:type="spellEnd"/>
-      <w:r>
-        <w:rPr>
-          <w:shd w:val="clear" w:color="auto" w:fill="FFFFD7"/>
-        </w:rPr>
-        <w:t>="</w:t>
-      </w:r>
-      <w:proofErr w:type="spellStart"/>
-      <w:r>
-        <w:rPr>
-          <w:shd w:val="clear" w:color="auto" w:fill="FFFFD7"/>
-        </w:rPr>
-        <w:t>news-item</w:t>
-      </w:r>
-      <w:proofErr w:type="spellEnd"/>
-      <w:r>
-        <w:rPr>
-          <w:shd w:val="clear" w:color="auto" w:fill="FFFFD7"/>
-        </w:rPr>
-        <w:t xml:space="preserve"> font-size-14"&gt;</w:t>
+        <w:t>&lt;div class="news-item font-size-14"&gt;</w:t>
       </w:r>
     </w:p>
     <w:p>
@@ -1288,63 +864,7 @@
         <w:rPr>
           <w:shd w:val="clear" w:color="auto" w:fill="FFFFD7"/>
         </w:rPr>
-        <w:t xml:space="preserve">    &lt;</w:t>
-      </w:r>
-      <w:proofErr w:type="spellStart"/>
-      <w:r>
-        <w:rPr>
-          <w:shd w:val="clear" w:color="auto" w:fill="FFFFD7"/>
-        </w:rPr>
-        <w:t>span</w:t>
-      </w:r>
-      <w:proofErr w:type="spellEnd"/>
-      <w:r>
-        <w:rPr>
-          <w:shd w:val="clear" w:color="auto" w:fill="FFFFD7"/>
-        </w:rPr>
-        <w:t xml:space="preserve"> </w:t>
-      </w:r>
-      <w:proofErr w:type="spellStart"/>
-      <w:r>
-        <w:rPr>
-          <w:shd w:val="clear" w:color="auto" w:fill="FFFFD7"/>
-        </w:rPr>
-        <w:t>class</w:t>
-      </w:r>
-      <w:proofErr w:type="spellEnd"/>
-      <w:r>
-        <w:rPr>
-          <w:shd w:val="clear" w:color="auto" w:fill="FFFFD7"/>
-        </w:rPr>
-        <w:t>="</w:t>
-      </w:r>
-      <w:proofErr w:type="spellStart"/>
-      <w:r>
-        <w:rPr>
-          <w:shd w:val="clear" w:color="auto" w:fill="FFFFD7"/>
-        </w:rPr>
-        <w:t>date</w:t>
-      </w:r>
-      <w:proofErr w:type="spellEnd"/>
-      <w:r>
-        <w:rPr>
-          <w:shd w:val="clear" w:color="auto" w:fill="FFFFD7"/>
-        </w:rPr>
-        <w:t>"&gt;2026. május 19.&lt;/</w:t>
-      </w:r>
-      <w:proofErr w:type="spellStart"/>
-      <w:r>
-        <w:rPr>
-          <w:shd w:val="clear" w:color="auto" w:fill="FFFFD7"/>
-        </w:rPr>
-        <w:t>span</w:t>
-      </w:r>
-      <w:proofErr w:type="spellEnd"/>
-      <w:r>
-        <w:rPr>
-          <w:shd w:val="clear" w:color="auto" w:fill="FFFFD7"/>
-        </w:rPr>
-        <w:t>&gt;</w:t>
+        <w:t xml:space="preserve">    &lt;span class="date"&gt;2026. május 19.&lt;/span&gt;</w:t>
       </w:r>
     </w:p>
     <w:p>
@@ -1361,49 +881,7 @@
         <w:rPr>
           <w:shd w:val="clear" w:color="auto" w:fill="FFFFD7"/>
         </w:rPr>
-        <w:t xml:space="preserve">    &lt;h2&gt;&lt;a </w:t>
-      </w:r>
-      <w:proofErr w:type="spellStart"/>
-      <w:r>
-        <w:rPr>
-          <w:shd w:val="clear" w:color="auto" w:fill="FFFFD7"/>
-        </w:rPr>
-        <w:t>href</w:t>
-      </w:r>
-      <w:proofErr w:type="spellEnd"/>
-      <w:r>
-        <w:rPr>
-          <w:shd w:val="clear" w:color="auto" w:fill="FFFFD7"/>
-        </w:rPr>
-        <w:t>="/</w:t>
-      </w:r>
-      <w:proofErr w:type="spellStart"/>
-      <w:r>
-        <w:rPr>
-          <w:shd w:val="clear" w:color="auto" w:fill="FFFFD7"/>
-        </w:rPr>
-        <w:t>hir</w:t>
-      </w:r>
-      <w:proofErr w:type="spellEnd"/>
-      <w:r>
-        <w:rPr>
-          <w:shd w:val="clear" w:color="auto" w:fill="FFFFD7"/>
-        </w:rPr>
-        <w:t>/diplomatervezes-</w:t>
-      </w:r>
-      <w:proofErr w:type="spellStart"/>
-      <w:r>
-        <w:rPr>
-          <w:shd w:val="clear" w:color="auto" w:fill="FFFFD7"/>
-        </w:rPr>
-        <w:t>hatarido</w:t>
-      </w:r>
-      <w:proofErr w:type="spellEnd"/>
-      <w:r>
-        <w:rPr>
-          <w:shd w:val="clear" w:color="auto" w:fill="FFFFD7"/>
-        </w:rPr>
-        <w:t>"&gt;Diplomatervezés leadási határidők változása&lt;/a&gt;&lt;/h2&gt;</w:t>
+        <w:t xml:space="preserve">    &lt;h2&gt;&lt;a href="/hir/diplomatervezes-hatarido"&gt;Diplomatervezés leadási határidők változása&lt;/a&gt;&lt;/h2&gt;</w:t>
       </w:r>
     </w:p>
     <w:p>
@@ -1420,21 +898,7 @@
         <w:rPr>
           <w:shd w:val="clear" w:color="auto" w:fill="FFFFD7"/>
         </w:rPr>
-        <w:t xml:space="preserve">    &lt;p&gt;Értesítjük a </w:t>
-      </w:r>
-      <w:proofErr w:type="spellStart"/>
-      <w:r>
-        <w:rPr>
-          <w:shd w:val="clear" w:color="auto" w:fill="FFFFD7"/>
-        </w:rPr>
-        <w:t>MSc</w:t>
-      </w:r>
-      <w:proofErr w:type="spellEnd"/>
-      <w:r>
-        <w:rPr>
-          <w:shd w:val="clear" w:color="auto" w:fill="FFFFD7"/>
-        </w:rPr>
-        <w:t xml:space="preserve"> hallgatókat, hogy a diplomatervezés 2 beszámolók leadási határideje módosult...&lt;/p&gt;</w:t>
+        <w:t xml:space="preserve">    &lt;p&gt;Értesítjük a MSc hallgatókat, hogy a diplomatervezés 2 beszámolók leadási határideje módosult...&lt;/p&gt;</w:t>
       </w:r>
     </w:p>
     <w:p>
@@ -1451,49 +915,7 @@
         <w:rPr>
           <w:shd w:val="clear" w:color="auto" w:fill="FFFFD7"/>
         </w:rPr>
-        <w:t xml:space="preserve">    &lt;div </w:t>
-      </w:r>
-      <w:proofErr w:type="spellStart"/>
-      <w:r>
-        <w:rPr>
-          <w:shd w:val="clear" w:color="auto" w:fill="FFFFD7"/>
-        </w:rPr>
-        <w:t>class</w:t>
-      </w:r>
-      <w:proofErr w:type="spellEnd"/>
-      <w:r>
-        <w:rPr>
-          <w:shd w:val="clear" w:color="auto" w:fill="FFFFD7"/>
-        </w:rPr>
-        <w:t>="</w:t>
-      </w:r>
-      <w:proofErr w:type="spellStart"/>
-      <w:r>
-        <w:rPr>
-          <w:shd w:val="clear" w:color="auto" w:fill="FFFFD7"/>
-        </w:rPr>
-        <w:t>tags</w:t>
-      </w:r>
-      <w:proofErr w:type="spellEnd"/>
-      <w:r>
-        <w:rPr>
-          <w:shd w:val="clear" w:color="auto" w:fill="FFFFD7"/>
-        </w:rPr>
-        <w:t xml:space="preserve">"&gt;Oktatás, </w:t>
-      </w:r>
-      <w:proofErr w:type="spellStart"/>
-      <w:r>
-        <w:rPr>
-          <w:shd w:val="clear" w:color="auto" w:fill="FFFFD7"/>
-        </w:rPr>
-        <w:t>MSc</w:t>
-      </w:r>
-      <w:proofErr w:type="spellEnd"/>
-      <w:r>
-        <w:rPr>
-          <w:shd w:val="clear" w:color="auto" w:fill="FFFFD7"/>
-        </w:rPr>
-        <w:t>, Fontos&lt;/div&gt;</w:t>
+        <w:t xml:space="preserve">    &lt;div class="tags"&gt;Oktatás, MSc, Fontos&lt;/div&gt;</w:t>
       </w:r>
     </w:p>
     <w:p>
@@ -1571,57 +993,19 @@
           <w:shd w:val="clear" w:color="auto" w:fill="FFFFD7"/>
         </w:rPr>
       </w:pPr>
-      <w:proofErr w:type="spellStart"/>
       <w:r>
         <w:rPr>
           <w:b/>
           <w:bCs/>
           <w:shd w:val="clear" w:color="auto" w:fill="FFFFD7"/>
         </w:rPr>
-        <w:t>Strukturálatlanság</w:t>
-      </w:r>
-      <w:proofErr w:type="spellEnd"/>
-      <w:r>
-        <w:rPr>
-          <w:b/>
-          <w:bCs/>
-          <w:shd w:val="clear" w:color="auto" w:fill="FFFFD7"/>
-        </w:rPr>
-        <w:t>:</w:t>
-      </w:r>
-      <w:r>
-        <w:rPr>
-          <w:shd w:val="clear" w:color="auto" w:fill="FFFFD7"/>
-        </w:rPr>
-        <w:t xml:space="preserve"> Az oldalak nem biztosítanak RSS </w:t>
-      </w:r>
-      <w:proofErr w:type="spellStart"/>
-      <w:r>
-        <w:rPr>
-          <w:shd w:val="clear" w:color="auto" w:fill="FFFFD7"/>
-        </w:rPr>
-        <w:t>feedet</w:t>
-      </w:r>
-      <w:proofErr w:type="spellEnd"/>
-      <w:r>
-        <w:rPr>
-          <w:shd w:val="clear" w:color="auto" w:fill="FFFFD7"/>
-        </w:rPr>
-        <w:t xml:space="preserve"> vagy JSON API-t, így a tiszta szöveget a HTML tagek (&lt;div&gt;, &lt;</w:t>
-      </w:r>
-      <w:proofErr w:type="spellStart"/>
-      <w:r>
-        <w:rPr>
-          <w:shd w:val="clear" w:color="auto" w:fill="FFFFD7"/>
-        </w:rPr>
-        <w:t>span</w:t>
-      </w:r>
-      <w:proofErr w:type="spellEnd"/>
-      <w:r>
-        <w:rPr>
-          <w:shd w:val="clear" w:color="auto" w:fill="FFFFD7"/>
-        </w:rPr>
-        <w:t>&gt;, beágyazott táblázatok) közül kell kibányászni.</w:t>
+        <w:t>Strukturálatlanság:</w:t>
+      </w:r>
+      <w:r>
+        <w:rPr>
+          <w:shd w:val="clear" w:color="auto" w:fill="FFFFD7"/>
+        </w:rPr>
+        <w:t xml:space="preserve"> Az oldalak nem biztosítanak RSS feedet vagy JSON API-t, így a tiszta szöveget a HTML tagek (&lt;div&gt;, &lt;span&gt;, beágyazott táblázatok) közül kell kibányászni.</w:t>
       </w:r>
     </w:p>
     <w:p>
@@ -1679,21 +1063,7 @@
         <w:rPr>
           <w:shd w:val="clear" w:color="auto" w:fill="FFFFD7"/>
         </w:rPr>
-        <w:t xml:space="preserve"> A magyar nyelvű dátumok (pl. "2026. május 19.", "2026-05-19", vagy csak "ma 14:00") keveredése miatt a hagyományos reguláris kifejezések (</w:t>
-      </w:r>
-      <w:proofErr w:type="spellStart"/>
-      <w:r>
-        <w:rPr>
-          <w:shd w:val="clear" w:color="auto" w:fill="FFFFD7"/>
-        </w:rPr>
-        <w:t>regex</w:t>
-      </w:r>
-      <w:proofErr w:type="spellEnd"/>
-      <w:r>
-        <w:rPr>
-          <w:shd w:val="clear" w:color="auto" w:fill="FFFFD7"/>
-        </w:rPr>
-        <w:t>) használata szinte lehetetlen volt az események pontos időpontjának kinyerésére.</w:t>
+        <w:t xml:space="preserve"> A magyar nyelvű dátumok (pl. "2026. május 19.", "2026-05-19", vagy csak "ma 14:00") keveredése miatt a hagyományos reguláris kifejezések (regex) használata szinte lehetetlen volt az események pontos időpontjának kinyerésére.</w:t>
       </w:r>
     </w:p>
     <w:p>
@@ -1719,25 +1089,7 @@
           <w:bCs/>
           <w:shd w:val="clear" w:color="auto" w:fill="FFFFD7"/>
         </w:rPr>
-        <w:t xml:space="preserve">Kimeneti adatmodell (A </w:t>
-      </w:r>
-      <w:proofErr w:type="spellStart"/>
-      <w:r>
-        <w:rPr>
-          <w:b/>
-          <w:bCs/>
-          <w:shd w:val="clear" w:color="auto" w:fill="FFFFD7"/>
-        </w:rPr>
-        <w:t>Pydantic</w:t>
-      </w:r>
-      <w:proofErr w:type="spellEnd"/>
-      <w:r>
-        <w:rPr>
-          <w:b/>
-          <w:bCs/>
-          <w:shd w:val="clear" w:color="auto" w:fill="FFFFD7"/>
-        </w:rPr>
-        <w:t xml:space="preserve"> validáció)</w:t>
+        <w:t>Kimeneti adatmodell (A Pydantic validáció)</w:t>
       </w:r>
     </w:p>
     <w:p>
@@ -1754,95 +1106,25 @@
         <w:rPr>
           <w:shd w:val="clear" w:color="auto" w:fill="FFFFD7"/>
         </w:rPr>
+        <w:t>Mivel a fenti forrásokból származó szövegek kaotikusak, az LLM (Mistral Large) segítségével a kinyert adatokat egy szigorúan típusos, validált JSON formátumra kényszerítjük a háttérben futó Pydantic modellel.</w:t>
+      </w:r>
+    </w:p>
+    <w:p>
+      <w:pPr>
+        <w:tabs>
+          <w:tab w:val="left" w:pos="542"/>
+        </w:tabs>
+        <w:spacing w:after="240"/>
+        <w:rPr>
+          <w:shd w:val="clear" w:color="auto" w:fill="FFFFD7"/>
+        </w:rPr>
+      </w:pPr>
+      <w:r>
+        <w:rPr>
+          <w:shd w:val="clear" w:color="auto" w:fill="FFFFD7"/>
+        </w:rPr>
         <w:lastRenderedPageBreak/>
-        <w:t>Mivel a fenti forrásokból származó szövegek kaotikusak, az LLM (</w:t>
-      </w:r>
-      <w:proofErr w:type="spellStart"/>
-      <w:r>
-        <w:rPr>
-          <w:shd w:val="clear" w:color="auto" w:fill="FFFFD7"/>
-        </w:rPr>
-        <w:t>Mistral</w:t>
-      </w:r>
-      <w:proofErr w:type="spellEnd"/>
-      <w:r>
-        <w:rPr>
-          <w:shd w:val="clear" w:color="auto" w:fill="FFFFD7"/>
-        </w:rPr>
-        <w:t xml:space="preserve"> </w:t>
-      </w:r>
-      <w:proofErr w:type="spellStart"/>
-      <w:r>
-        <w:rPr>
-          <w:shd w:val="clear" w:color="auto" w:fill="FFFFD7"/>
-        </w:rPr>
-        <w:t>Large</w:t>
-      </w:r>
-      <w:proofErr w:type="spellEnd"/>
-      <w:r>
-        <w:rPr>
-          <w:shd w:val="clear" w:color="auto" w:fill="FFFFD7"/>
-        </w:rPr>
-        <w:t xml:space="preserve">) segítségével a kinyert adatokat egy szigorúan típusos, </w:t>
-      </w:r>
-      <w:proofErr w:type="spellStart"/>
-      <w:r>
-        <w:rPr>
-          <w:shd w:val="clear" w:color="auto" w:fill="FFFFD7"/>
-        </w:rPr>
-        <w:t>validált</w:t>
-      </w:r>
-      <w:proofErr w:type="spellEnd"/>
-      <w:r>
-        <w:rPr>
-          <w:shd w:val="clear" w:color="auto" w:fill="FFFFD7"/>
-        </w:rPr>
-        <w:t xml:space="preserve"> JSON formátumra kényszerítjük a háttérben futó </w:t>
-      </w:r>
-      <w:proofErr w:type="spellStart"/>
-      <w:r>
-        <w:rPr>
-          <w:shd w:val="clear" w:color="auto" w:fill="FFFFD7"/>
-        </w:rPr>
-        <w:t>Pydantic</w:t>
-      </w:r>
-      <w:proofErr w:type="spellEnd"/>
-      <w:r>
-        <w:rPr>
-          <w:shd w:val="clear" w:color="auto" w:fill="FFFFD7"/>
-        </w:rPr>
-        <w:t xml:space="preserve"> modellel.</w:t>
-      </w:r>
-    </w:p>
-    <w:p>
-      <w:pPr>
-        <w:tabs>
-          <w:tab w:val="left" w:pos="542"/>
-        </w:tabs>
-        <w:spacing w:after="240"/>
-        <w:rPr>
-          <w:shd w:val="clear" w:color="auto" w:fill="FFFFD7"/>
-        </w:rPr>
-      </w:pPr>
-      <w:r>
-        <w:rPr>
-          <w:shd w:val="clear" w:color="auto" w:fill="FFFFD7"/>
-        </w:rPr>
-        <w:t xml:space="preserve">A sikeresen feldolgozott, immár </w:t>
-      </w:r>
-      <w:proofErr w:type="spellStart"/>
-      <w:r>
-        <w:rPr>
-          <w:shd w:val="clear" w:color="auto" w:fill="FFFFD7"/>
-        </w:rPr>
-        <w:t>downstream</w:t>
-      </w:r>
-      <w:proofErr w:type="spellEnd"/>
-      <w:r>
-        <w:rPr>
-          <w:shd w:val="clear" w:color="auto" w:fill="FFFFD7"/>
-        </w:rPr>
-        <w:t xml:space="preserve"> eszközök (n8n) számára emészthető adat az alábbi tisztított struktúrát követi:</w:t>
+        <w:t>A sikeresen feldolgozott, immár downstream eszközök (n8n) számára emészthető adat az alábbi tisztított struktúrát követi:</w:t>
       </w:r>
     </w:p>
     <w:p>
@@ -1894,21 +1176,7 @@
         <w:rPr>
           <w:shd w:val="clear" w:color="auto" w:fill="FFFFD7"/>
         </w:rPr>
-        <w:t xml:space="preserve">  "</w:t>
-      </w:r>
-      <w:proofErr w:type="spellStart"/>
-      <w:r>
-        <w:rPr>
-          <w:shd w:val="clear" w:color="auto" w:fill="FFFFD7"/>
-        </w:rPr>
-        <w:t>source</w:t>
-      </w:r>
-      <w:proofErr w:type="spellEnd"/>
-      <w:r>
-        <w:rPr>
-          <w:shd w:val="clear" w:color="auto" w:fill="FFFFD7"/>
-        </w:rPr>
-        <w:t>": "BME-VIK",</w:t>
+        <w:t xml:space="preserve">  "source": "BME-VIK",</w:t>
       </w:r>
     </w:p>
     <w:p>
@@ -1925,21 +1193,7 @@
         <w:rPr>
           <w:shd w:val="clear" w:color="auto" w:fill="FFFFD7"/>
         </w:rPr>
-        <w:t xml:space="preserve">  "</w:t>
-      </w:r>
-      <w:proofErr w:type="spellStart"/>
-      <w:r>
-        <w:rPr>
-          <w:shd w:val="clear" w:color="auto" w:fill="FFFFD7"/>
-        </w:rPr>
-        <w:t>title</w:t>
-      </w:r>
-      <w:proofErr w:type="spellEnd"/>
-      <w:r>
-        <w:rPr>
-          <w:shd w:val="clear" w:color="auto" w:fill="FFFFD7"/>
-        </w:rPr>
-        <w:t>": "Diplomatervezés leadási határidők változása",</w:t>
+        <w:t xml:space="preserve">  "title": "Diplomatervezés leadási határidők változása",</w:t>
       </w:r>
     </w:p>
     <w:p>
@@ -1956,35 +1210,7 @@
         <w:rPr>
           <w:shd w:val="clear" w:color="auto" w:fill="FFFFD7"/>
         </w:rPr>
-        <w:t xml:space="preserve">  "</w:t>
-      </w:r>
-      <w:proofErr w:type="spellStart"/>
-      <w:r>
-        <w:rPr>
-          <w:shd w:val="clear" w:color="auto" w:fill="FFFFD7"/>
-        </w:rPr>
-        <w:t>content_summary</w:t>
-      </w:r>
-      <w:proofErr w:type="spellEnd"/>
-      <w:r>
-        <w:rPr>
-          <w:shd w:val="clear" w:color="auto" w:fill="FFFFD7"/>
-        </w:rPr>
-        <w:t xml:space="preserve">": "Módosult az </w:t>
-      </w:r>
-      <w:proofErr w:type="spellStart"/>
-      <w:r>
-        <w:rPr>
-          <w:shd w:val="clear" w:color="auto" w:fill="FFFFD7"/>
-        </w:rPr>
-        <w:t>MSc</w:t>
-      </w:r>
-      <w:proofErr w:type="spellEnd"/>
-      <w:r>
-        <w:rPr>
-          <w:shd w:val="clear" w:color="auto" w:fill="FFFFD7"/>
-        </w:rPr>
-        <w:t xml:space="preserve"> diplomatervezés 2 beszámolók leadási határideje a kari szabályzat változása miatt.",</w:t>
+        <w:t xml:space="preserve">  "content_summary": "Módosult az MSc diplomatervezés 2 beszámolók leadási határideje a kari szabályzat változása miatt.",</w:t>
       </w:r>
     </w:p>
     <w:p>
@@ -2001,35 +1227,7 @@
         <w:rPr>
           <w:shd w:val="clear" w:color="auto" w:fill="FFFFD7"/>
         </w:rPr>
-        <w:t xml:space="preserve">  "</w:t>
-      </w:r>
-      <w:proofErr w:type="spellStart"/>
-      <w:r>
-        <w:rPr>
-          <w:shd w:val="clear" w:color="auto" w:fill="FFFFD7"/>
-        </w:rPr>
-        <w:t>event_type</w:t>
-      </w:r>
-      <w:proofErr w:type="spellEnd"/>
-      <w:r>
-        <w:rPr>
-          <w:shd w:val="clear" w:color="auto" w:fill="FFFFD7"/>
-        </w:rPr>
-        <w:t>": "</w:t>
-      </w:r>
-      <w:proofErr w:type="spellStart"/>
-      <w:r>
-        <w:rPr>
-          <w:shd w:val="clear" w:color="auto" w:fill="FFFFD7"/>
-        </w:rPr>
-        <w:t>academic_deadline</w:t>
-      </w:r>
-      <w:proofErr w:type="spellEnd"/>
-      <w:r>
-        <w:rPr>
-          <w:shd w:val="clear" w:color="auto" w:fill="FFFFD7"/>
-        </w:rPr>
-        <w:t>",</w:t>
+        <w:t xml:space="preserve">  "event_type": "academic_deadline",</w:t>
       </w:r>
     </w:p>
     <w:p>
@@ -2046,21 +1244,7 @@
         <w:rPr>
           <w:shd w:val="clear" w:color="auto" w:fill="FFFFD7"/>
         </w:rPr>
-        <w:t xml:space="preserve">  "</w:t>
-      </w:r>
-      <w:proofErr w:type="spellStart"/>
-      <w:r>
-        <w:rPr>
-          <w:shd w:val="clear" w:color="auto" w:fill="FFFFD7"/>
-        </w:rPr>
-        <w:t>extracted_date</w:t>
-      </w:r>
-      <w:proofErr w:type="spellEnd"/>
-      <w:r>
-        <w:rPr>
-          <w:shd w:val="clear" w:color="auto" w:fill="FFFFD7"/>
-        </w:rPr>
-        <w:t>": "2026-05-19",</w:t>
+        <w:t xml:space="preserve">  "extracted_date": "2026-05-19",</w:t>
       </w:r>
     </w:p>
     <w:p>
@@ -2077,21 +1261,7 @@
         <w:rPr>
           <w:shd w:val="clear" w:color="auto" w:fill="FFFFD7"/>
         </w:rPr>
-        <w:t xml:space="preserve">  "</w:t>
-      </w:r>
-      <w:proofErr w:type="spellStart"/>
-      <w:r>
-        <w:rPr>
-          <w:shd w:val="clear" w:color="auto" w:fill="FFFFD7"/>
-        </w:rPr>
-        <w:t>generated_social_posts</w:t>
-      </w:r>
-      <w:proofErr w:type="spellEnd"/>
-      <w:r>
-        <w:rPr>
-          <w:shd w:val="clear" w:color="auto" w:fill="FFFFD7"/>
-        </w:rPr>
-        <w:t>": {</w:t>
+        <w:t xml:space="preserve">  "generated_social_posts": {</w:t>
       </w:r>
     </w:p>
     <w:p>
@@ -2108,21 +1278,7 @@
         <w:rPr>
           <w:shd w:val="clear" w:color="auto" w:fill="FFFFD7"/>
         </w:rPr>
-        <w:t xml:space="preserve">    "</w:t>
-      </w:r>
-      <w:proofErr w:type="spellStart"/>
-      <w:r>
-        <w:rPr>
-          <w:shd w:val="clear" w:color="auto" w:fill="FFFFD7"/>
-        </w:rPr>
-        <w:t>linkedin</w:t>
-      </w:r>
-      <w:proofErr w:type="spellEnd"/>
-      <w:r>
-        <w:rPr>
-          <w:shd w:val="clear" w:color="auto" w:fill="FFFFD7"/>
-        </w:rPr>
-        <w:t>": "</w:t>
+        <w:t xml:space="preserve">    "linkedin": "</w:t>
       </w:r>
       <w:r>
         <w:rPr>
@@ -2135,21 +1291,7 @@
         <w:rPr>
           <w:shd w:val="clear" w:color="auto" w:fill="FFFFD7"/>
         </w:rPr>
-        <w:t xml:space="preserve"> Figyelem </w:t>
-      </w:r>
-      <w:proofErr w:type="spellStart"/>
-      <w:r>
-        <w:rPr>
-          <w:shd w:val="clear" w:color="auto" w:fill="FFFFD7"/>
-        </w:rPr>
-        <w:t>MSc</w:t>
-      </w:r>
-      <w:proofErr w:type="spellEnd"/>
-      <w:r>
-        <w:rPr>
-          <w:shd w:val="clear" w:color="auto" w:fill="FFFFD7"/>
-        </w:rPr>
-        <w:t xml:space="preserve"> hallgatók! Módosult a diplomatervezés 2 beszámolók leadási határideje. Részletek a VIK oldalán. #BMEVIK #MSc #Diplomatervezes",</w:t>
+        <w:t xml:space="preserve"> Figyelem MSc hallgatók! Módosult a diplomatervezés 2 beszámolók leadási határideje. Részletek a VIK oldalán. #BMEVIK #MSc #Diplomatervezes",</w:t>
       </w:r>
     </w:p>
     <w:p>
@@ -2218,21 +1360,7 @@
         <w:rPr>
           <w:shd w:val="clear" w:color="auto" w:fill="FFFFD7"/>
         </w:rPr>
-        <w:t xml:space="preserve">Ezzel a megközelítéssel sikerült elérni, hogy az adatminőségi hibákat teljesen kiküszöböljük, és az n8n </w:t>
-      </w:r>
-      <w:proofErr w:type="spellStart"/>
-      <w:r>
-        <w:rPr>
-          <w:shd w:val="clear" w:color="auto" w:fill="FFFFD7"/>
-        </w:rPr>
-        <w:t>workflow</w:t>
-      </w:r>
-      <w:proofErr w:type="spellEnd"/>
-      <w:r>
-        <w:rPr>
-          <w:shd w:val="clear" w:color="auto" w:fill="FFFFD7"/>
-        </w:rPr>
-        <w:t xml:space="preserve"> már csak tiszta, garantáltan azonos felépítésű objektumokat kapjon.</w:t>
+        <w:t>Ezzel a megközelítéssel sikerült elérni, hogy az adatminőségi hibákat teljesen kiküszöböljük, és az n8n workflow már csak tiszta, garantáltan azonos felépítésű objektumokat kapjon.</w:t>
       </w:r>
     </w:p>
     <w:p>

</xml_diff>